<commit_message>
Update the README, model cards, demo guide, architecture diagram, presentation and speaker script for the two-stream work
</commit_message>
<xml_diff>
--- a/Kaya_IIT-Hyderabad/docs/Kaya_speaker_script.docx
+++ b/Kaya_IIT-Hyderabad/docs/Kaya_speaker_script.docx
@@ -12,7 +12,7 @@
     </w:p>
     <w:p>
       <w:r>
-        <w:t>Demo already shown in the video. Click straight through: skip slides 2, 7, 9, 10, 11, 15 and 18. Total about 3:26.</w:t>
+        <w:t>Demo already shown in the video. Click straight through: skip slides 2, 7, 9, 10, 11, 16 and 19. Total about 4:01. To stay near 3:26, also skip the new slide 14 (Heart watch, about 0:35).</w:t>
       </w:r>
     </w:p>
     <w:p>
@@ -276,7 +276,7 @@
     </w:p>
     <w:p>
       <w:r>
-        <w:t>The architecture. Five inputs: wearable glucose every five minutes plus heart rate, sleep and steps; EHR and labs; the retina scan; the patient's log; and voice. An encoder fuses them into one twin per patient. On it sit four modules, glucose, liver, eye and kidney, and a what-if engine. One FastAPI layer serves REST, a live WebSocket and FHIR R4 to three roles: patient, doctor and admin.</w:t>
+        <w:t>The architecture. Five inputs: wearable glucose every five minutes plus heart rate, sleep and steps; EHR and labs; the retina scan; the patient's log; and voice. An encoder fuses them into one twin per patient. On it sit five modules, glucose, liver, eye, kidney and the Heart watch, and a what-if engine. One FastAPI layer serves REST, a live WebSocket and FHIR R4 to three roles: patient, doctor and admin.</w:t>
       </w:r>
     </w:p>
     <w:p>
@@ -298,7 +298,29 @@
     </w:p>
     <w:p>
       <w:r>
-        <w:t>The models. Glucose: a GRU blended with LightGBM, with conformal 80 percent intervals. On real CGMacros data, error at one hour is 21 against 26 mg/dL for no-change, and alerts catch 72 percent of lows 45 minutes early. Liver fibrosis reaches 0.83 AUROC on NHANES against 0.63 for FIB-4. Kidney matches a strong baseline, so our value is the eGFR trajectory, a labelled simulation. The eye is EfficientNet-B2 with Grad-CAM: kappa 0.89 on APTOS, 0.71 on the Indian IDRiD set.</w:t>
+        <w:t>The models. Glucose: a GRU blended with LightGBM, with conformal 80 percent intervals. On real CGMacros data, error at one hour is 21 against 26 mg/dL for no-change, and alerts catch 72 percent of lows 45 minutes early. Liver fibrosis reaches 0.83 AUROC on NHANES against 0.63 for FIB-4. Kidney matches a strong baseline, so our value is the eGFR trajectory, a labelled simulation. The eye is EfficientNet-B2 with Grad-CAM: kappa 0.89 on APTOS, 0.71 on the Indian IDRiD set. A fifth model, the Heart watch, is on the next slide.</w:t>
+      </w:r>
+    </w:p>
+    <w:p>
+      <w:pPr>
+        <w:pStyle w:val="Heading2"/>
+      </w:pPr>
+      <w:r>
+        <w:t>13b. The Heart watch (second adverse event)</w:t>
+      </w:r>
+    </w:p>
+    <w:p>
+      <w:r>
+        <w:rPr>
+          <w:i/>
+          <w:sz w:val="20"/>
+        </w:rPr>
+        <w:t>[Slide 14 | about 0:35 | running total 3:26 | optional]</w:t>
+      </w:r>
+    </w:p>
+    <w:p>
+      <w:r>
+        <w:t>The brief asks us to fuse a record with a wearable stream and predict an adverse event. For glucose we do that, and we added a second event: a cardiovascular flag. Every morning it reads the last seven nights of sleep, HRV, resting heart rate and steps, together with the patient's record. One model asks whether a prodrome is under way, another how dangerous that is for this person, and a small stacker combines them; every alert lists its drivers. On 2,000 synthetic patients with five-fold cross-validation it catches 76 percent of events about 23 hours ahead, at roughly one false alert per patient-month, against 44 percent for a simple clinical rule. Be plain about the limits: the wearable week does most of the work, the record adds a modest gain, HRV and sleep add little for glucose, and the data is synthetic with assumed couplings and far more events than real life.</w:t>
       </w:r>
     </w:p>
     <w:p>
@@ -315,7 +337,7 @@
           <w:i/>
           <w:sz w:val="20"/>
         </w:rPr>
-        <w:t>[Slide 14 | about 0:15 | running total 3:06]</w:t>
+        <w:t>[Slide 15 | about 0:15 | running total 3:41]</w:t>
       </w:r>
     </w:p>
     <w:p>
@@ -337,7 +359,7 @@
           <w:i/>
           <w:sz w:val="20"/>
         </w:rPr>
-        <w:t>[Slide 15 | SKIP in the 5-minute version]</w:t>
+        <w:t>[Slide 16 | SKIP in the 5-minute version]</w:t>
       </w:r>
     </w:p>
     <w:p>
@@ -359,7 +381,7 @@
           <w:i/>
           <w:sz w:val="20"/>
         </w:rPr>
-        <w:t>[Slide 16 | about 0:12 | running total 3:18]</w:t>
+        <w:t>[Slide 17 | about 0:12 | running total 3:53]</w:t>
       </w:r>
     </w:p>
     <w:p>
@@ -381,7 +403,7 @@
           <w:i/>
           <w:sz w:val="20"/>
         </w:rPr>
-        <w:t>[Slide 17 | about 0:08 | running total 3:26]</w:t>
+        <w:t>[Slide 18 | about 0:08 | running total 4:01]</w:t>
       </w:r>
     </w:p>
     <w:p>
@@ -403,7 +425,7 @@
           <w:i/>
           <w:sz w:val="20"/>
         </w:rPr>
-        <w:t>[Slide 18 | SKIP in the 5-minute version]</w:t>
+        <w:t>[Slide 19 | SKIP in the 5-minute version]</w:t>
       </w:r>
     </w:p>
     <w:p>

</xml_diff>